<commit_message>
docs: retirer les references au depot des livrables
Le rapport et les diapositives ne mentionnent plus l'adresse du depot ni la
carte de ses dossiers. La procedure de reproduction est conservee en annexe :
le sujet demande un document permettant de relancer les mesures.

Le PDF des diapositives est supprime : la presentation se rend en .pptx.
</commit_message>
<xml_diff>
--- a/Rapport_DRL.docx
+++ b/Rapport_DRL.docx
@@ -150,21 +150,6 @@
           <w:sz w:val="18"/>
         </w:rPr>
         <w:t>[à compléter : prénoms et noms complets]</w:t>
-      </w:r>
-    </w:p>
-    <w:p>
-      <w:pPr>
-        <w:spacing w:after="0"/>
-        <w:jc w:val="center"/>
-      </w:pPr>
-      <w:r>
-        <w:rPr>
-          <w:b w:val="0"/>
-          <w:i w:val="0"/>
-          <w:color w:val="555A66"/>
-          <w:sz w:val="19"/>
-        </w:rPr>
-        <w:t>Code source : github.com/KaabiOmar/drl-project</w:t>
       </w:r>
     </w:p>
     <w:p>
@@ -10165,441 +10150,6 @@
         </w:rPr>
         <w:t>python -m src.gui.app --env bobail --agent human</w:t>
       </w:r>
-    </w:p>
-    <w:p>
-      <w:pPr>
-        <w:pStyle w:val="Heading2"/>
-      </w:pPr>
-      <w:r>
-        <w:t>Contenu du dépôt</w:t>
-      </w:r>
-    </w:p>
-    <w:tbl>
-      <w:tblPr>
-        <w:tblStyle w:val="TableGrid"/>
-        <w:tblW w:type="auto" w:w="0"/>
-        <w:jc w:val="center"/>
-        <w:tblLook w:firstColumn="1" w:firstRow="1" w:lastColumn="0" w:lastRow="0" w:noHBand="0" w:noVBand="1" w:val="04A0"/>
-      </w:tblPr>
-      <w:tblGrid>
-        <w:gridCol w:w="4703"/>
-        <w:gridCol w:w="4703"/>
-      </w:tblGrid>
-      <w:tr>
-        <w:tc>
-          <w:tcPr>
-            <w:tcW w:type="dxa" w:w="3288"/>
-            <w:shd w:val="clear" w:fill="E8ECF4"/>
-          </w:tcPr>
-          <w:p>
-            <w:pPr>
-              <w:spacing w:after="40"/>
-            </w:pPr>
-            <w:r/>
-            <w:r>
-              <w:rPr>
-                <w:b/>
-                <w:sz w:val="18"/>
-              </w:rPr>
-              <w:t>Chemin</w:t>
-            </w:r>
-          </w:p>
-        </w:tc>
-        <w:tc>
-          <w:tcPr>
-            <w:tcW w:type="dxa" w:w="5499"/>
-            <w:shd w:val="clear" w:fill="E8ECF4"/>
-          </w:tcPr>
-          <w:p>
-            <w:pPr>
-              <w:spacing w:after="40"/>
-            </w:pPr>
-            <w:r/>
-            <w:r>
-              <w:rPr>
-                <w:b/>
-                <w:sz w:val="18"/>
-              </w:rPr>
-              <w:t>Contenu</w:t>
-            </w:r>
-          </w:p>
-        </w:tc>
-      </w:tr>
-      <w:tr>
-        <w:tc>
-          <w:tcPr>
-            <w:tcW w:type="dxa" w:w="3288"/>
-          </w:tcPr>
-          <w:p>
-            <w:pPr>
-              <w:spacing w:after="40"/>
-            </w:pPr>
-            <w:r/>
-            <w:r>
-              <w:rPr>
-                <w:sz w:val="18"/>
-              </w:rPr>
-              <w:t>src/envs/</w:t>
-            </w:r>
-          </w:p>
-        </w:tc>
-        <w:tc>
-          <w:tcPr>
-            <w:tcW w:type="dxa" w:w="5499"/>
-          </w:tcPr>
-          <w:p>
-            <w:pPr>
-              <w:spacing w:after="40"/>
-              <w:jc w:val="right"/>
-            </w:pPr>
-            <w:r/>
-            <w:r>
-              <w:rPr>
-                <w:sz w:val="18"/>
-              </w:rPr>
-              <w:t>les quatre environnements, derrière une interface commune</w:t>
-            </w:r>
-          </w:p>
-        </w:tc>
-      </w:tr>
-      <w:tr>
-        <w:tc>
-          <w:tcPr>
-            <w:tcW w:type="dxa" w:w="3288"/>
-          </w:tcPr>
-          <w:p>
-            <w:pPr>
-              <w:spacing w:after="40"/>
-            </w:pPr>
-            <w:r/>
-            <w:r>
-              <w:rPr>
-                <w:sz w:val="18"/>
-              </w:rPr>
-              <w:t>src/agents/</w:t>
-            </w:r>
-          </w:p>
-        </w:tc>
-        <w:tc>
-          <w:tcPr>
-            <w:tcW w:type="dxa" w:w="5499"/>
-          </w:tcPr>
-          <w:p>
-            <w:pPr>
-              <w:spacing w:after="40"/>
-              <w:jc w:val="right"/>
-            </w:pPr>
-            <w:r/>
-            <w:r>
-              <w:rPr>
-                <w:sz w:val="18"/>
-              </w:rPr>
-              <w:t>les onze agents, exposés par un registre unique</w:t>
-            </w:r>
-          </w:p>
-        </w:tc>
-      </w:tr>
-      <w:tr>
-        <w:tc>
-          <w:tcPr>
-            <w:tcW w:type="dxa" w:w="3288"/>
-          </w:tcPr>
-          <w:p>
-            <w:pPr>
-              <w:spacing w:after="40"/>
-            </w:pPr>
-            <w:r/>
-            <w:r>
-              <w:rPr>
-                <w:sz w:val="18"/>
-              </w:rPr>
-              <w:t>src/common/</w:t>
-            </w:r>
-          </w:p>
-        </w:tc>
-        <w:tc>
-          <w:tcPr>
-            <w:tcW w:type="dxa" w:w="5499"/>
-          </w:tcPr>
-          <w:p>
-            <w:pPr>
-              <w:spacing w:after="40"/>
-              <w:jc w:val="right"/>
-            </w:pPr>
-            <w:r/>
-            <w:r>
-              <w:rPr>
-                <w:sz w:val="18"/>
-              </w:rPr>
-              <w:t>masquage, mémoires de rejeu, réseaux, métriques, graines</w:t>
-            </w:r>
-          </w:p>
-        </w:tc>
-      </w:tr>
-      <w:tr>
-        <w:tc>
-          <w:tcPr>
-            <w:tcW w:type="dxa" w:w="3288"/>
-          </w:tcPr>
-          <w:p>
-            <w:pPr>
-              <w:spacing w:after="40"/>
-            </w:pPr>
-            <w:r/>
-            <w:r>
-              <w:rPr>
-                <w:sz w:val="18"/>
-              </w:rPr>
-              <w:t>src/gui/</w:t>
-            </w:r>
-          </w:p>
-        </w:tc>
-        <w:tc>
-          <w:tcPr>
-            <w:tcW w:type="dxa" w:w="5499"/>
-          </w:tcPr>
-          <w:p>
-            <w:pPr>
-              <w:spacing w:after="40"/>
-              <w:jc w:val="right"/>
-            </w:pPr>
-            <w:r/>
-            <w:r>
-              <w:rPr>
-                <w:sz w:val="18"/>
-              </w:rPr>
-              <w:t>interface graphique, agent humain inclus</w:t>
-            </w:r>
-          </w:p>
-        </w:tc>
-      </w:tr>
-      <w:tr>
-        <w:tc>
-          <w:tcPr>
-            <w:tcW w:type="dxa" w:w="3288"/>
-          </w:tcPr>
-          <w:p>
-            <w:pPr>
-              <w:spacing w:after="40"/>
-            </w:pPr>
-            <w:r/>
-            <w:r>
-              <w:rPr>
-                <w:sz w:val="18"/>
-              </w:rPr>
-              <w:t>configs/</w:t>
-            </w:r>
-          </w:p>
-        </w:tc>
-        <w:tc>
-          <w:tcPr>
-            <w:tcW w:type="dxa" w:w="5499"/>
-          </w:tcPr>
-          <w:p>
-            <w:pPr>
-              <w:spacing w:after="40"/>
-              <w:jc w:val="right"/>
-            </w:pPr>
-            <w:r/>
-            <w:r>
-              <w:rPr>
-                <w:sz w:val="18"/>
-              </w:rPr>
-              <w:t>un fichier d'hyperparamètres par algorithme</w:t>
-            </w:r>
-          </w:p>
-        </w:tc>
-      </w:tr>
-      <w:tr>
-        <w:tc>
-          <w:tcPr>
-            <w:tcW w:type="dxa" w:w="3288"/>
-          </w:tcPr>
-          <w:p>
-            <w:pPr>
-              <w:spacing w:after="40"/>
-            </w:pPr>
-            <w:r/>
-            <w:r>
-              <w:rPr>
-                <w:sz w:val="18"/>
-              </w:rPr>
-              <w:t>docs/</w:t>
-            </w:r>
-          </w:p>
-        </w:tc>
-        <w:tc>
-          <w:tcPr>
-            <w:tcW w:type="dxa" w:w="5499"/>
-          </w:tcPr>
-          <w:p>
-            <w:pPr>
-              <w:spacing w:after="40"/>
-              <w:jc w:val="right"/>
-            </w:pPr>
-            <w:r/>
-            <w:r>
-              <w:rPr>
-                <w:sz w:val="18"/>
-              </w:rPr>
-              <w:t>spécifications d'encodage et règles du Bobail</w:t>
-            </w:r>
-          </w:p>
-        </w:tc>
-      </w:tr>
-      <w:tr>
-        <w:tc>
-          <w:tcPr>
-            <w:tcW w:type="dxa" w:w="3288"/>
-          </w:tcPr>
-          <w:p>
-            <w:pPr>
-              <w:spacing w:after="40"/>
-            </w:pPr>
-            <w:r/>
-            <w:r>
-              <w:rPr>
-                <w:sz w:val="18"/>
-              </w:rPr>
-              <w:t>runs/, runs_random/, runs_heuristic/</w:t>
-            </w:r>
-          </w:p>
-        </w:tc>
-        <w:tc>
-          <w:tcPr>
-            <w:tcW w:type="dxa" w:w="5499"/>
-          </w:tcPr>
-          <w:p>
-            <w:pPr>
-              <w:spacing w:after="40"/>
-              <w:jc w:val="right"/>
-            </w:pPr>
-            <w:r/>
-            <w:r>
-              <w:rPr>
-                <w:sz w:val="18"/>
-              </w:rPr>
-              <w:t>mesures brutes des trois campagnes</w:t>
-            </w:r>
-          </w:p>
-        </w:tc>
-      </w:tr>
-      <w:tr>
-        <w:tc>
-          <w:tcPr>
-            <w:tcW w:type="dxa" w:w="3288"/>
-          </w:tcPr>
-          <w:p>
-            <w:pPr>
-              <w:spacing w:after="40"/>
-            </w:pPr>
-            <w:r/>
-            <w:r>
-              <w:rPr>
-                <w:sz w:val="18"/>
-              </w:rPr>
-              <w:t>models_livrables/</w:t>
-            </w:r>
-          </w:p>
-        </w:tc>
-        <w:tc>
-          <w:tcPr>
-            <w:tcW w:type="dxa" w:w="5499"/>
-          </w:tcPr>
-          <w:p>
-            <w:pPr>
-              <w:spacing w:after="40"/>
-              <w:jc w:val="right"/>
-            </w:pPr>
-            <w:r/>
-            <w:r>
-              <w:rPr>
-                <w:sz w:val="18"/>
-              </w:rPr>
-              <w:t>40 modèles finaux, prêts à être rejoués</w:t>
-            </w:r>
-          </w:p>
-        </w:tc>
-      </w:tr>
-      <w:tr>
-        <w:tc>
-          <w:tcPr>
-            <w:tcW w:type="dxa" w:w="3288"/>
-          </w:tcPr>
-          <w:p>
-            <w:pPr>
-              <w:spacing w:after="40"/>
-            </w:pPr>
-            <w:r/>
-            <w:r>
-              <w:rPr>
-                <w:sz w:val="18"/>
-              </w:rPr>
-              <w:t>reports/</w:t>
-            </w:r>
-          </w:p>
-        </w:tc>
-        <w:tc>
-          <w:tcPr>
-            <w:tcW w:type="dxa" w:w="5499"/>
-          </w:tcPr>
-          <w:p>
-            <w:pPr>
-              <w:spacing w:after="40"/>
-              <w:jc w:val="right"/>
-            </w:pPr>
-            <w:r/>
-            <w:r>
-              <w:rPr>
-                <w:sz w:val="18"/>
-              </w:rPr>
-              <w:t>tableaux de synthèse et figures</w:t>
-            </w:r>
-          </w:p>
-        </w:tc>
-      </w:tr>
-      <w:tr>
-        <w:tc>
-          <w:tcPr>
-            <w:tcW w:type="dxa" w:w="3288"/>
-          </w:tcPr>
-          <w:p>
-            <w:pPr>
-              <w:spacing w:after="40"/>
-            </w:pPr>
-            <w:r/>
-            <w:r>
-              <w:rPr>
-                <w:sz w:val="18"/>
-              </w:rPr>
-              <w:t>tests/</w:t>
-            </w:r>
-          </w:p>
-        </w:tc>
-        <w:tc>
-          <w:tcPr>
-            <w:tcW w:type="dxa" w:w="5499"/>
-          </w:tcPr>
-          <w:p>
-            <w:pPr>
-              <w:spacing w:after="40"/>
-              <w:jc w:val="right"/>
-            </w:pPr>
-            <w:r/>
-            <w:r>
-              <w:rPr>
-                <w:sz w:val="18"/>
-              </w:rPr>
-              <w:t>30 tests unitaires</w:t>
-            </w:r>
-          </w:p>
-        </w:tc>
-      </w:tr>
-    </w:tbl>
-    <w:p>
-      <w:pPr>
-        <w:spacing w:after="80"/>
-      </w:pPr>
     </w:p>
     <w:sectPr>
       <w:pgSz w:w="12240" w:h="15840"/>

</xml_diff>

<commit_message>
docs: sommaire reel dans le rapport, marqueur de noms retire
Le sommaire etait un champ TOC de Word : vide tant que l'utilisateur ne met pas
les champs a jour, et vide dans le PDF produit par LibreOffice. Remplace par une
table des matieres statique, 26 entrees avec points de conduite et numeros de
page, plus un numero de page en pied de page.

Les numeros viennent d'une premiere conversion en PDF puis d'une recherche du
titre page par page ; un controle verifie que chaque entree pointe bien sur la
page ou le titre apparait. 26/26 coherentes.

Retire aussi le marqueur [a completer] de la page de titre et de la premiere
diapositive.
</commit_message>
<xml_diff>
--- a/Rapport_DRL.docx
+++ b/Rapport_DRL.docx
@@ -140,17 +140,7 @@
     <w:p>
       <w:pPr>
         <w:spacing w:after="600"/>
-        <w:jc w:val="center"/>
       </w:pPr>
-      <w:r>
-        <w:rPr>
-          <w:b w:val="0"/>
-          <w:i/>
-          <w:color w:val="555A66"/>
-          <w:sz w:val="18"/>
-        </w:rPr>
-        <w:t>[à compléter : prénoms et noms complets]</w:t>
-      </w:r>
     </w:p>
     <w:p>
       <w:r>
@@ -166,11 +156,628 @@
       </w:r>
     </w:p>
     <w:p>
-      <w:fldSimple w:instr="TOC \o &quot;1-2&quot; \h \z \u">
-        <w:r>
-          <w:t>Faites un clic droit ici puis « Mettre à jour les champs » pour générer le sommaire.</w:t>
-        </w:r>
-      </w:fldSimple>
+      <w:pPr>
+        <w:tabs>
+          <w:tab w:pos="9071" w:val="right" w:leader="dot"/>
+        </w:tabs>
+        <w:spacing w:after="100"/>
+        <w:ind w:left="0"/>
+      </w:pPr>
+      <w:r>
+        <w:rPr>
+          <w:b/>
+          <w:sz w:val="21"/>
+        </w:rPr>
+        <w:t>1. Objet et périmètre</w:t>
+      </w:r>
+      <w:r>
+        <w:rPr>
+          <w:b/>
+          <w:sz w:val="21"/>
+        </w:rPr>
+        <w:tab/>
+        <w:t>3</w:t>
+      </w:r>
+    </w:p>
+    <w:p>
+      <w:pPr>
+        <w:tabs>
+          <w:tab w:pos="9071" w:val="right" w:leader="dot"/>
+        </w:tabs>
+        <w:spacing w:after="60"/>
+        <w:ind w:left="454"/>
+      </w:pPr>
+      <w:r>
+        <w:rPr>
+          <w:b w:val="0"/>
+          <w:sz w:val="20"/>
+        </w:rPr>
+        <w:t>1.1 Ce que le rapport établit</w:t>
+      </w:r>
+      <w:r>
+        <w:rPr>
+          <w:b w:val="0"/>
+          <w:sz w:val="20"/>
+        </w:rPr>
+        <w:tab/>
+        <w:t>3</w:t>
+      </w:r>
+    </w:p>
+    <w:p>
+      <w:pPr>
+        <w:tabs>
+          <w:tab w:pos="9071" w:val="right" w:leader="dot"/>
+        </w:tabs>
+        <w:spacing w:after="60"/>
+        <w:ind w:left="454"/>
+      </w:pPr>
+      <w:r>
+        <w:rPr>
+          <w:b w:val="0"/>
+          <w:sz w:val="20"/>
+        </w:rPr>
+        <w:t>1.2 Organisation du code</w:t>
+      </w:r>
+      <w:r>
+        <w:rPr>
+          <w:b w:val="0"/>
+          <w:sz w:val="20"/>
+        </w:rPr>
+        <w:tab/>
+        <w:t>3</w:t>
+      </w:r>
+    </w:p>
+    <w:p>
+      <w:pPr>
+        <w:tabs>
+          <w:tab w:pos="9071" w:val="right" w:leader="dot"/>
+        </w:tabs>
+        <w:spacing w:after="100"/>
+        <w:ind w:left="0"/>
+      </w:pPr>
+      <w:r>
+        <w:rPr>
+          <w:b/>
+          <w:sz w:val="21"/>
+        </w:rPr>
+        <w:t>2. Les environnements</w:t>
+      </w:r>
+      <w:r>
+        <w:rPr>
+          <w:b/>
+          <w:sz w:val="21"/>
+        </w:rPr>
+        <w:tab/>
+        <w:t>3</w:t>
+      </w:r>
+    </w:p>
+    <w:p>
+      <w:pPr>
+        <w:tabs>
+          <w:tab w:pos="9071" w:val="right" w:leader="dot"/>
+        </w:tabs>
+        <w:spacing w:after="60"/>
+        <w:ind w:left="454"/>
+      </w:pPr>
+      <w:r>
+        <w:rPr>
+          <w:b w:val="0"/>
+          <w:sz w:val="20"/>
+        </w:rPr>
+        <w:t>2.1 Interface commune</w:t>
+      </w:r>
+      <w:r>
+        <w:rPr>
+          <w:b w:val="0"/>
+          <w:sz w:val="20"/>
+        </w:rPr>
+        <w:tab/>
+        <w:t>3</w:t>
+      </w:r>
+    </w:p>
+    <w:p>
+      <w:pPr>
+        <w:tabs>
+          <w:tab w:pos="9071" w:val="right" w:leader="dot"/>
+        </w:tabs>
+        <w:spacing w:after="60"/>
+        <w:ind w:left="454"/>
+      </w:pPr>
+      <w:r>
+        <w:rPr>
+          <w:b w:val="0"/>
+          <w:sz w:val="20"/>
+        </w:rPr>
+        <w:t>2.2 Encodages retenus</w:t>
+      </w:r>
+      <w:r>
+        <w:rPr>
+          <w:b w:val="0"/>
+          <w:sz w:val="20"/>
+        </w:rPr>
+        <w:tab/>
+        <w:t>4</w:t>
+      </w:r>
+    </w:p>
+    <w:p>
+      <w:pPr>
+        <w:tabs>
+          <w:tab w:pos="9071" w:val="right" w:leader="dot"/>
+        </w:tabs>
+        <w:spacing w:after="60"/>
+        <w:ind w:left="454"/>
+      </w:pPr>
+      <w:r>
+        <w:rPr>
+          <w:b w:val="0"/>
+          <w:sz w:val="20"/>
+        </w:rPr>
+        <w:t>2.3 Débit de simulation</w:t>
+      </w:r>
+      <w:r>
+        <w:rPr>
+          <w:b w:val="0"/>
+          <w:sz w:val="20"/>
+        </w:rPr>
+        <w:tab/>
+        <w:t>4</w:t>
+      </w:r>
+    </w:p>
+    <w:p>
+      <w:pPr>
+        <w:tabs>
+          <w:tab w:pos="9071" w:val="right" w:leader="dot"/>
+        </w:tabs>
+        <w:spacing w:after="100"/>
+        <w:ind w:left="0"/>
+      </w:pPr>
+      <w:r>
+        <w:rPr>
+          <w:b/>
+          <w:sz w:val="21"/>
+        </w:rPr>
+        <w:t>3. Les onze agents</w:t>
+      </w:r>
+      <w:r>
+        <w:rPr>
+          <w:b/>
+          <w:sz w:val="21"/>
+        </w:rPr>
+        <w:tab/>
+        <w:t>4</w:t>
+      </w:r>
+    </w:p>
+    <w:p>
+      <w:pPr>
+        <w:tabs>
+          <w:tab w:pos="9071" w:val="right" w:leader="dot"/>
+        </w:tabs>
+        <w:spacing w:after="60"/>
+        <w:ind w:left="454"/>
+      </w:pPr>
+      <w:r>
+        <w:rPr>
+          <w:b w:val="0"/>
+          <w:sz w:val="20"/>
+        </w:rPr>
+        <w:t>3.1 Famille valeur</w:t>
+      </w:r>
+      <w:r>
+        <w:rPr>
+          <w:b w:val="0"/>
+          <w:sz w:val="20"/>
+        </w:rPr>
+        <w:tab/>
+        <w:t>4</w:t>
+      </w:r>
+    </w:p>
+    <w:p>
+      <w:pPr>
+        <w:tabs>
+          <w:tab w:pos="9071" w:val="right" w:leader="dot"/>
+        </w:tabs>
+        <w:spacing w:after="60"/>
+        <w:ind w:left="454"/>
+      </w:pPr>
+      <w:r>
+        <w:rPr>
+          <w:b w:val="0"/>
+          <w:sz w:val="20"/>
+        </w:rPr>
+        <w:t>3.2 Famille gradient de politique</w:t>
+      </w:r>
+      <w:r>
+        <w:rPr>
+          <w:b w:val="0"/>
+          <w:sz w:val="20"/>
+        </w:rPr>
+        <w:tab/>
+        <w:t>5</w:t>
+      </w:r>
+    </w:p>
+    <w:p>
+      <w:pPr>
+        <w:tabs>
+          <w:tab w:pos="9071" w:val="right" w:leader="dot"/>
+        </w:tabs>
+        <w:spacing w:after="60"/>
+        <w:ind w:left="454"/>
+      </w:pPr>
+      <w:r>
+        <w:rPr>
+          <w:b w:val="0"/>
+          <w:sz w:val="20"/>
+        </w:rPr>
+        <w:t>3.3 PPO, style A2C</w:t>
+      </w:r>
+      <w:r>
+        <w:rPr>
+          <w:b w:val="0"/>
+          <w:sz w:val="20"/>
+        </w:rPr>
+        <w:tab/>
+        <w:t>5</w:t>
+      </w:r>
+    </w:p>
+    <w:p>
+      <w:pPr>
+        <w:tabs>
+          <w:tab w:pos="9071" w:val="right" w:leader="dot"/>
+        </w:tabs>
+        <w:spacing w:after="60"/>
+        <w:ind w:left="454"/>
+      </w:pPr>
+      <w:r>
+        <w:rPr>
+          <w:b w:val="0"/>
+          <w:sz w:val="20"/>
+        </w:rPr>
+        <w:t>3.4 Agents de planification</w:t>
+      </w:r>
+      <w:r>
+        <w:rPr>
+          <w:b w:val="0"/>
+          <w:sz w:val="20"/>
+        </w:rPr>
+        <w:tab/>
+        <w:t>6</w:t>
+      </w:r>
+    </w:p>
+    <w:p>
+      <w:pPr>
+        <w:tabs>
+          <w:tab w:pos="9071" w:val="right" w:leader="dot"/>
+        </w:tabs>
+        <w:spacing w:after="100"/>
+        <w:ind w:left="0"/>
+      </w:pPr>
+      <w:r>
+        <w:rPr>
+          <w:b/>
+          <w:sz w:val="21"/>
+        </w:rPr>
+        <w:t>4. Protocole expérimental</w:t>
+      </w:r>
+      <w:r>
+        <w:rPr>
+          <w:b/>
+          <w:sz w:val="21"/>
+        </w:rPr>
+        <w:tab/>
+        <w:t>6</w:t>
+      </w:r>
+    </w:p>
+    <w:p>
+      <w:pPr>
+        <w:tabs>
+          <w:tab w:pos="9071" w:val="right" w:leader="dot"/>
+        </w:tabs>
+        <w:spacing w:after="60"/>
+        <w:ind w:left="454"/>
+      </w:pPr>
+      <w:r>
+        <w:rPr>
+          <w:b w:val="0"/>
+          <w:sz w:val="20"/>
+        </w:rPr>
+        <w:t>4.1 La politique obtenue, jamais la politique d'entraînement</w:t>
+      </w:r>
+      <w:r>
+        <w:rPr>
+          <w:b w:val="0"/>
+          <w:sz w:val="20"/>
+        </w:rPr>
+        <w:tab/>
+        <w:t>6</w:t>
+      </w:r>
+    </w:p>
+    <w:p>
+      <w:pPr>
+        <w:tabs>
+          <w:tab w:pos="9071" w:val="right" w:leader="dot"/>
+        </w:tabs>
+        <w:spacing w:after="60"/>
+        <w:ind w:left="454"/>
+      </w:pPr>
+      <w:r>
+        <w:rPr>
+          <w:b w:val="0"/>
+          <w:sz w:val="20"/>
+        </w:rPr>
+        <w:t>4.2 Graines et reproductibilité</w:t>
+      </w:r>
+      <w:r>
+        <w:rPr>
+          <w:b w:val="0"/>
+          <w:sz w:val="20"/>
+        </w:rPr>
+        <w:tab/>
+        <w:t>6</w:t>
+      </w:r>
+    </w:p>
+    <w:p>
+      <w:pPr>
+        <w:tabs>
+          <w:tab w:pos="9071" w:val="right" w:leader="dot"/>
+        </w:tabs>
+        <w:spacing w:after="60"/>
+        <w:ind w:left="454"/>
+      </w:pPr>
+      <w:r>
+        <w:rPr>
+          <w:b w:val="0"/>
+          <w:sz w:val="20"/>
+        </w:rPr>
+        <w:t>4.3 Choix des hyperparamètres</w:t>
+      </w:r>
+      <w:r>
+        <w:rPr>
+          <w:b w:val="0"/>
+          <w:sz w:val="20"/>
+        </w:rPr>
+        <w:tab/>
+        <w:t>6</w:t>
+      </w:r>
+    </w:p>
+    <w:p>
+      <w:pPr>
+        <w:tabs>
+          <w:tab w:pos="9071" w:val="right" w:leader="dot"/>
+        </w:tabs>
+        <w:spacing w:after="100"/>
+        <w:ind w:left="0"/>
+      </w:pPr>
+      <w:r>
+        <w:rPr>
+          <w:b/>
+          <w:sz w:val="21"/>
+        </w:rPr>
+        <w:t>5. Résultats</w:t>
+      </w:r>
+      <w:r>
+        <w:rPr>
+          <w:b/>
+          <w:sz w:val="21"/>
+        </w:rPr>
+        <w:tab/>
+        <w:t>8</w:t>
+      </w:r>
+    </w:p>
+    <w:p>
+      <w:pPr>
+        <w:tabs>
+          <w:tab w:pos="9071" w:val="right" w:leader="dot"/>
+        </w:tabs>
+        <w:spacing w:after="60"/>
+        <w:ind w:left="454"/>
+      </w:pPr>
+      <w:r>
+        <w:rPr>
+          <w:b w:val="0"/>
+          <w:sz w:val="20"/>
+        </w:rPr>
+        <w:t>5.1 Line World</w:t>
+      </w:r>
+      <w:r>
+        <w:rPr>
+          <w:b w:val="0"/>
+          <w:sz w:val="20"/>
+        </w:rPr>
+        <w:tab/>
+        <w:t>8</w:t>
+      </w:r>
+    </w:p>
+    <w:p>
+      <w:pPr>
+        <w:tabs>
+          <w:tab w:pos="9071" w:val="right" w:leader="dot"/>
+        </w:tabs>
+        <w:spacing w:after="60"/>
+        <w:ind w:left="454"/>
+      </w:pPr>
+      <w:r>
+        <w:rPr>
+          <w:b w:val="0"/>
+          <w:sz w:val="20"/>
+        </w:rPr>
+        <w:t>5.2 Grid World</w:t>
+      </w:r>
+      <w:r>
+        <w:rPr>
+          <w:b w:val="0"/>
+          <w:sz w:val="20"/>
+        </w:rPr>
+        <w:tab/>
+        <w:t>8</w:t>
+      </w:r>
+    </w:p>
+    <w:p>
+      <w:pPr>
+        <w:tabs>
+          <w:tab w:pos="9071" w:val="right" w:leader="dot"/>
+        </w:tabs>
+        <w:spacing w:after="60"/>
+        <w:ind w:left="454"/>
+      </w:pPr>
+      <w:r>
+        <w:rPr>
+          <w:b w:val="0"/>
+          <w:sz w:val="20"/>
+        </w:rPr>
+        <w:t>5.3 TicTacToe versus Random</w:t>
+      </w:r>
+      <w:r>
+        <w:rPr>
+          <w:b w:val="0"/>
+          <w:sz w:val="20"/>
+        </w:rPr>
+        <w:tab/>
+        <w:t>9</w:t>
+      </w:r>
+    </w:p>
+    <w:p>
+      <w:pPr>
+        <w:tabs>
+          <w:tab w:pos="9071" w:val="right" w:leader="dot"/>
+        </w:tabs>
+        <w:spacing w:after="60"/>
+        <w:ind w:left="454"/>
+      </w:pPr>
+      <w:r>
+        <w:rPr>
+          <w:b w:val="0"/>
+          <w:sz w:val="20"/>
+        </w:rPr>
+        <w:t>5.4 Bobail contre un adversaire aléatoire</w:t>
+      </w:r>
+      <w:r>
+        <w:rPr>
+          <w:b w:val="0"/>
+          <w:sz w:val="20"/>
+        </w:rPr>
+        <w:tab/>
+        <w:t>10</w:t>
+      </w:r>
+    </w:p>
+    <w:p>
+      <w:pPr>
+        <w:tabs>
+          <w:tab w:pos="9071" w:val="right" w:leader="dot"/>
+        </w:tabs>
+        <w:spacing w:after="60"/>
+        <w:ind w:left="454"/>
+      </w:pPr>
+      <w:r>
+        <w:rPr>
+          <w:b w:val="0"/>
+          <w:sz w:val="20"/>
+        </w:rPr>
+        <w:t>5.5 Bobail contre un adversaire heuristique</w:t>
+      </w:r>
+      <w:r>
+        <w:rPr>
+          <w:b w:val="0"/>
+          <w:sz w:val="20"/>
+        </w:rPr>
+        <w:tab/>
+        <w:t>11</w:t>
+      </w:r>
+    </w:p>
+    <w:p>
+      <w:pPr>
+        <w:tabs>
+          <w:tab w:pos="9071" w:val="right" w:leader="dot"/>
+        </w:tabs>
+        <w:spacing w:after="100"/>
+        <w:ind w:left="0"/>
+      </w:pPr>
+      <w:r>
+        <w:rPr>
+          <w:b/>
+          <w:sz w:val="21"/>
+        </w:rPr>
+        <w:t>6. Observations critiques</w:t>
+      </w:r>
+      <w:r>
+        <w:rPr>
+          <w:b/>
+          <w:sz w:val="21"/>
+        </w:rPr>
+        <w:tab/>
+        <w:t>13</w:t>
+      </w:r>
+    </w:p>
+    <w:p>
+      <w:pPr>
+        <w:tabs>
+          <w:tab w:pos="9071" w:val="right" w:leader="dot"/>
+        </w:tabs>
+        <w:spacing w:after="100"/>
+        <w:ind w:left="0"/>
+      </w:pPr>
+      <w:r>
+        <w:rPr>
+          <w:b/>
+          <w:sz w:val="21"/>
+        </w:rPr>
+        <w:t>7. Limites de l'étude</w:t>
+      </w:r>
+      <w:r>
+        <w:rPr>
+          <w:b/>
+          <w:sz w:val="21"/>
+        </w:rPr>
+        <w:tab/>
+        <w:t>15</w:t>
+      </w:r>
+    </w:p>
+    <w:p>
+      <w:pPr>
+        <w:tabs>
+          <w:tab w:pos="9071" w:val="right" w:leader="dot"/>
+        </w:tabs>
+        <w:spacing w:after="100"/>
+        <w:ind w:left="0"/>
+      </w:pPr>
+      <w:r>
+        <w:rPr>
+          <w:b/>
+          <w:sz w:val="21"/>
+        </w:rPr>
+        <w:t>8. Conclusion</w:t>
+      </w:r>
+      <w:r>
+        <w:rPr>
+          <w:b/>
+          <w:sz w:val="21"/>
+        </w:rPr>
+        <w:tab/>
+        <w:t>16</w:t>
+      </w:r>
+    </w:p>
+    <w:p>
+      <w:pPr>
+        <w:tabs>
+          <w:tab w:pos="9071" w:val="right" w:leader="dot"/>
+        </w:tabs>
+        <w:spacing w:after="100"/>
+        <w:ind w:left="0"/>
+      </w:pPr>
+      <w:r>
+        <w:rPr>
+          <w:b/>
+          <w:sz w:val="21"/>
+        </w:rPr>
+        <w:t>Annexe — Reproduire les résultats</w:t>
+      </w:r>
+      <w:r>
+        <w:rPr>
+          <w:b/>
+          <w:sz w:val="21"/>
+        </w:rPr>
+        <w:tab/>
+        <w:t>17</w:t>
+      </w:r>
     </w:p>
     <w:p>
       <w:r>
@@ -276,7 +883,7 @@
         <w:pStyle w:val="Heading2"/>
       </w:pPr>
       <w:r>
-        <w:t>1.2 Organisation du dépôt</w:t>
+        <w:t>1.2 Organisation du code</w:t>
       </w:r>
     </w:p>
     <w:p>
@@ -10152,6 +10759,7 @@
       </w:r>
     </w:p>
     <w:sectPr>
+      <w:footerReference w:type="default" r:id="rId14"/>
       <w:pgSz w:w="12240" w:h="15840"/>
       <w:pgMar w:top="1247" w:right="1417" w:bottom="1247" w:left="1417" w:header="720" w:footer="720" w:gutter="0"/>
       <w:cols w:space="720"/>
@@ -10159,6 +10767,22 @@
     </w:sectPr>
   </w:body>
 </w:document>
+</file>
+
+<file path=word/footer1.xml><?xml version="1.0" encoding="utf-8"?>
+<w:ftr xmlns:m="http://schemas.openxmlformats.org/officeDocument/2006/math" xmlns:mc="http://schemas.openxmlformats.org/markup-compatibility/2006" xmlns:mo="http://schemas.microsoft.com/office/mac/office/2008/main" xmlns:mv="urn:schemas-microsoft-com:mac:vml" xmlns:o="urn:schemas-microsoft-com:office:office" xmlns:r="http://schemas.openxmlformats.org/officeDocument/2006/relationships" xmlns:v="urn:schemas-microsoft-com:vml" xmlns:w10="urn:schemas-microsoft-com:office:word" xmlns:w14="http://schemas.microsoft.com/office/word/2010/wordml" xmlns:w="http://schemas.openxmlformats.org/wordprocessingml/2006/main" xmlns:wne="http://schemas.microsoft.com/office/word/2006/wordml" xmlns:wp14="http://schemas.microsoft.com/office/word/2010/wordprocessingDrawing" xmlns:wp="http://schemas.openxmlformats.org/drawingml/2006/wordprocessingDrawing" xmlns:wpc="http://schemas.microsoft.com/office/word/2010/wordprocessingCanvas" xmlns:wpg="http://schemas.microsoft.com/office/word/2010/wordprocessingGroup" xmlns:wpi="http://schemas.microsoft.com/office/word/2010/wordprocessingInk" xmlns:wps="http://schemas.microsoft.com/office/word/2010/wordprocessingShape" mc:Ignorable="w14 wp14">
+  <w:p>
+    <w:pPr>
+      <w:pStyle w:val="Footer"/>
+      <w:jc w:val="center"/>
+    </w:pPr>
+    <w:fldSimple w:instr="PAGE">
+      <w:r>
+        <w:t>1</w:t>
+      </w:r>
+    </w:fldSimple>
+  </w:p>
+</w:ftr>
 </file>
 
 <file path=word/numbering.xml><?xml version="1.0" encoding="utf-8"?>

</xml_diff>

<commit_message>
fix(rapport): remesurer le taux de menaces ignorees sur ce depot
Le rapport et les diapositives annoncaient 31,8 % de menaces ignorees et 99,3 %
de victoires. Ces deux chiffres venaient d'une mesure faite sur un AUTRE depot,
avec un autre encodage d'etat et un autre modele.

Remesure ici, en enumerant les 1 178 positions ou l'adversaire menace de gagner
au coup suivant et en interrogeant notre ddqn_per entraine a 1 000 000
d'episodes : 51,3 % de cas ou il gagne lui-meme, 28,6 % ou il bloque, 20,1 % ou
il ignore la menace. Taux de victoire reel : 99,0 %.
</commit_message>
<xml_diff>
--- a/Rapport_DRL.docx
+++ b/Rapport_DRL.docx
@@ -10486,7 +10486,16 @@
           <w:b w:val="0"/>
           <w:i/>
         </w:rPr>
-        <w:t>Une vérification menée sur TicTacToe illustre le risque. Notre meilleur agent y gagne 99,3 % des parties, mais examen fait, il ignore 31,8 % des situations où l'adversaire menace de gagner au coup suivant : il attaque au lieu de se défendre. Contre un adversaire aléatoire cette stratégie est optimale, puisque la menace n'est presque jamais exécutée. L'agent n'a pas appris le morpion, il a appris à exploiter un adversaire aléatoire.</w:t>
+        <w:t>Une vérification menée sur TicTacToe illustre le risque. Nous avons énuméré les 1 178 positions où l'adversaire menace de gagner au coup suivant, et interrogé notre meilleur agent — Double DQN à rejeu priorisé, 99,0 % de victoires. Dans 51,3 % des cas il gagne lui-même, ce qui est préférable à défendre ; dans 28,6 % il bloque ; mais dans 20,1 % des cas il ignore purement et simplement la menace.</w:t>
+      </w:r>
+    </w:p>
+    <w:p>
+      <w:r>
+        <w:rPr>
+          <w:b w:val="0"/>
+          <w:i/>
+        </w:rPr>
+        <w:t>Contre un adversaire aléatoire cette stratégie est rationnelle : la menace n'est presque jamais exécutée, donc attaquer rapporte davantage que se défendre. L'agent n'a pas appris le morpion, il a appris à exploiter un adversaire aléatoire. Le score seul ne le dirait pas.</w:t>
       </w:r>
     </w:p>
     <w:p>

</xml_diff>